<commit_message>
Similar systems researched added
</commit_message>
<xml_diff>
--- a/Research & Context/CompiledResearch.docx
+++ b/Research & Context/CompiledResearch.docx
@@ -947,26 +947,721 @@
           <w:szCs w:val="24"/>
           <w:lang w:val="en-US"/>
         </w:rPr>
-        <w:t xml:space="preserve">Interviews: Ideally, we could perform a couple of interviews </w:t>
-      </w:r>
-      <w:proofErr w:type="gramStart"/>
-      <w:r>
-        <w:rPr>
-          <w:sz w:val="24"/>
-          <w:szCs w:val="24"/>
-          <w:lang w:val="en-US"/>
-        </w:rPr>
-        <w:t>to</w:t>
-      </w:r>
-      <w:proofErr w:type="gramEnd"/>
-      <w:r>
-        <w:rPr>
-          <w:sz w:val="24"/>
-          <w:szCs w:val="24"/>
-          <w:lang w:val="en-US"/>
-        </w:rPr>
-        <w:t xml:space="preserve"> people who fit the description for our primary user, this way we can get some more personal information and contrast if their thoughts on the topic are similar.</w:t>
-      </w:r>
+        <w:t>Interviews: Ideally, we could perform a couple of interviews to people who fit the description for our primary user, this way we can get some more personal information and contrast if their thoughts on the topic are similar.</w:t>
+      </w:r>
+    </w:p>
+    <w:p>
+      <w:pPr>
+        <w:rPr>
+          <w:b/>
+          <w:bCs/>
+          <w:sz w:val="28"/>
+          <w:szCs w:val="28"/>
+          <w:lang w:val="en-US"/>
+        </w:rPr>
+      </w:pPr>
+      <w:r>
+        <w:rPr>
+          <w:b/>
+          <w:bCs/>
+          <w:sz w:val="28"/>
+          <w:szCs w:val="28"/>
+          <w:lang w:val="en-US"/>
+        </w:rPr>
+        <w:t>Similar apps</w:t>
+      </w:r>
+    </w:p>
+    <w:p>
+      <w:pPr>
+        <w:rPr>
+          <w:sz w:val="24"/>
+          <w:szCs w:val="24"/>
+          <w:lang w:val="en-US"/>
+        </w:rPr>
+      </w:pPr>
+      <w:r>
+        <w:rPr>
+          <w:sz w:val="24"/>
+          <w:szCs w:val="24"/>
+          <w:lang w:val="en-US"/>
+        </w:rPr>
+        <w:t>T</w:t>
+      </w:r>
+      <w:r>
+        <w:rPr>
+          <w:sz w:val="24"/>
+          <w:szCs w:val="24"/>
+          <w:lang w:val="en-US"/>
+        </w:rPr>
+        <w:t>here are similar apps available to train soft skills, even though each one use a different way to teach the</w:t>
+      </w:r>
+      <w:r>
+        <w:rPr>
+          <w:sz w:val="24"/>
+          <w:szCs w:val="24"/>
+          <w:lang w:val="en-US"/>
+        </w:rPr>
+        <w:t xml:space="preserve"> users. Here are some examples:</w:t>
+      </w:r>
+    </w:p>
+    <w:p>
+      <w:pPr>
+        <w:numPr>
+          <w:ilvl w:val="0"/>
+          <w:numId w:val="2"/>
+        </w:numPr>
+        <w:rPr>
+          <w:sz w:val="24"/>
+          <w:szCs w:val="24"/>
+        </w:rPr>
+      </w:pPr>
+      <w:r>
+        <w:rPr>
+          <w:b/>
+          <w:bCs/>
+          <w:sz w:val="24"/>
+          <w:szCs w:val="24"/>
+        </w:rPr>
+        <w:t>Coursera</w:t>
+      </w:r>
+    </w:p>
+    <w:p>
+      <w:pPr>
+        <w:numPr>
+          <w:ilvl w:val="1"/>
+          <w:numId w:val="2"/>
+        </w:numPr>
+        <w:rPr>
+          <w:sz w:val="24"/>
+          <w:szCs w:val="24"/>
+          <w:lang w:val="en-US"/>
+        </w:rPr>
+      </w:pPr>
+      <w:r>
+        <w:rPr>
+          <w:b/>
+          <w:bCs/>
+          <w:sz w:val="24"/>
+          <w:szCs w:val="24"/>
+          <w:lang w:val="en-US"/>
+        </w:rPr>
+        <w:t>Description</w:t>
+      </w:r>
+      <w:r>
+        <w:rPr>
+          <w:sz w:val="24"/>
+          <w:szCs w:val="24"/>
+          <w:lang w:val="en-US"/>
+        </w:rPr>
+        <w:t>: Offers a wide range of online courses from top universities, including soft skills like communication and leadership.</w:t>
+      </w:r>
+    </w:p>
+    <w:p>
+      <w:pPr>
+        <w:numPr>
+          <w:ilvl w:val="1"/>
+          <w:numId w:val="2"/>
+        </w:numPr>
+        <w:rPr>
+          <w:sz w:val="24"/>
+          <w:szCs w:val="24"/>
+        </w:rPr>
+      </w:pPr>
+      <w:r>
+        <w:rPr>
+          <w:b/>
+          <w:bCs/>
+          <w:sz w:val="24"/>
+          <w:szCs w:val="24"/>
+        </w:rPr>
+        <w:t>Platforms</w:t>
+      </w:r>
+      <w:r>
+        <w:rPr>
+          <w:sz w:val="24"/>
+          <w:szCs w:val="24"/>
+        </w:rPr>
+        <w:t>: Android, iPhone</w:t>
+      </w:r>
+    </w:p>
+    <w:p>
+      <w:pPr>
+        <w:numPr>
+          <w:ilvl w:val="1"/>
+          <w:numId w:val="2"/>
+        </w:numPr>
+        <w:rPr>
+          <w:sz w:val="24"/>
+          <w:szCs w:val="24"/>
+        </w:rPr>
+      </w:pPr>
+      <w:r>
+        <w:rPr>
+          <w:b/>
+          <w:bCs/>
+          <w:sz w:val="24"/>
+          <w:szCs w:val="24"/>
+        </w:rPr>
+        <w:t>Website</w:t>
+      </w:r>
+      <w:r>
+        <w:rPr>
+          <w:sz w:val="24"/>
+          <w:szCs w:val="24"/>
+        </w:rPr>
+        <w:t>: </w:t>
+      </w:r>
+      <w:hyperlink r:id="rId6" w:tgtFrame="_blank" w:history="1">
+        <w:r>
+          <w:rPr>
+            <w:rStyle w:val="Hipervnculo"/>
+            <w:sz w:val="24"/>
+            <w:szCs w:val="24"/>
+          </w:rPr>
+          <w:t>coursera.org</w:t>
+        </w:r>
+      </w:hyperlink>
+    </w:p>
+    <w:p>
+      <w:pPr>
+        <w:numPr>
+          <w:ilvl w:val="0"/>
+          <w:numId w:val="2"/>
+        </w:numPr>
+        <w:rPr>
+          <w:sz w:val="24"/>
+          <w:szCs w:val="24"/>
+        </w:rPr>
+      </w:pPr>
+      <w:r>
+        <w:rPr>
+          <w:b/>
+          <w:bCs/>
+          <w:sz w:val="24"/>
+          <w:szCs w:val="24"/>
+        </w:rPr>
+        <w:t>VirtualSpeech</w:t>
+      </w:r>
+    </w:p>
+    <w:p>
+      <w:pPr>
+        <w:numPr>
+          <w:ilvl w:val="1"/>
+          <w:numId w:val="2"/>
+        </w:numPr>
+        <w:rPr>
+          <w:sz w:val="24"/>
+          <w:szCs w:val="24"/>
+          <w:lang w:val="en-US"/>
+        </w:rPr>
+      </w:pPr>
+      <w:r>
+        <w:rPr>
+          <w:b/>
+          <w:bCs/>
+          <w:sz w:val="24"/>
+          <w:szCs w:val="24"/>
+          <w:lang w:val="en-US"/>
+        </w:rPr>
+        <w:t>Description</w:t>
+      </w:r>
+      <w:r>
+        <w:rPr>
+          <w:sz w:val="24"/>
+          <w:szCs w:val="24"/>
+          <w:lang w:val="en-US"/>
+        </w:rPr>
+        <w:t>: Uses VR to practice communication skills such as public speaking and leadership.</w:t>
+      </w:r>
+    </w:p>
+    <w:p>
+      <w:pPr>
+        <w:numPr>
+          <w:ilvl w:val="1"/>
+          <w:numId w:val="2"/>
+        </w:numPr>
+        <w:rPr>
+          <w:sz w:val="24"/>
+          <w:szCs w:val="24"/>
+        </w:rPr>
+      </w:pPr>
+      <w:r>
+        <w:rPr>
+          <w:b/>
+          <w:bCs/>
+          <w:sz w:val="24"/>
+          <w:szCs w:val="24"/>
+        </w:rPr>
+        <w:t>Platforms</w:t>
+      </w:r>
+      <w:r>
+        <w:rPr>
+          <w:sz w:val="24"/>
+          <w:szCs w:val="24"/>
+        </w:rPr>
+        <w:t>: Android, iPhone, VR headsets</w:t>
+      </w:r>
+    </w:p>
+    <w:p>
+      <w:pPr>
+        <w:numPr>
+          <w:ilvl w:val="1"/>
+          <w:numId w:val="2"/>
+        </w:numPr>
+        <w:rPr>
+          <w:sz w:val="24"/>
+          <w:szCs w:val="24"/>
+        </w:rPr>
+      </w:pPr>
+      <w:r>
+        <w:rPr>
+          <w:b/>
+          <w:bCs/>
+          <w:sz w:val="24"/>
+          <w:szCs w:val="24"/>
+        </w:rPr>
+        <w:t>Website</w:t>
+      </w:r>
+      <w:r>
+        <w:rPr>
+          <w:sz w:val="24"/>
+          <w:szCs w:val="24"/>
+        </w:rPr>
+        <w:t>: </w:t>
+      </w:r>
+      <w:hyperlink r:id="rId7" w:tgtFrame="_blank" w:history="1">
+        <w:r>
+          <w:rPr>
+            <w:rStyle w:val="Hipervnculo"/>
+            <w:sz w:val="24"/>
+            <w:szCs w:val="24"/>
+          </w:rPr>
+          <w:t>virtualspeech.com</w:t>
+        </w:r>
+      </w:hyperlink>
+    </w:p>
+    <w:p>
+      <w:pPr>
+        <w:numPr>
+          <w:ilvl w:val="0"/>
+          <w:numId w:val="2"/>
+        </w:numPr>
+        <w:rPr>
+          <w:sz w:val="24"/>
+          <w:szCs w:val="24"/>
+        </w:rPr>
+      </w:pPr>
+      <w:r>
+        <w:rPr>
+          <w:b/>
+          <w:bCs/>
+          <w:sz w:val="24"/>
+          <w:szCs w:val="24"/>
+        </w:rPr>
+        <w:t>edX</w:t>
+      </w:r>
+    </w:p>
+    <w:p>
+      <w:pPr>
+        <w:numPr>
+          <w:ilvl w:val="1"/>
+          <w:numId w:val="2"/>
+        </w:numPr>
+        <w:rPr>
+          <w:sz w:val="24"/>
+          <w:szCs w:val="24"/>
+          <w:lang w:val="en-US"/>
+        </w:rPr>
+      </w:pPr>
+      <w:r>
+        <w:rPr>
+          <w:b/>
+          <w:bCs/>
+          <w:sz w:val="24"/>
+          <w:szCs w:val="24"/>
+          <w:lang w:val="en-US"/>
+        </w:rPr>
+        <w:t>Description</w:t>
+      </w:r>
+      <w:r>
+        <w:rPr>
+          <w:sz w:val="24"/>
+          <w:szCs w:val="24"/>
+          <w:lang w:val="en-US"/>
+        </w:rPr>
+        <w:t>: Provides online courses from renowned institutions like Harvard and MIT, covering various soft skills.</w:t>
+      </w:r>
+    </w:p>
+    <w:p>
+      <w:pPr>
+        <w:numPr>
+          <w:ilvl w:val="1"/>
+          <w:numId w:val="2"/>
+        </w:numPr>
+        <w:rPr>
+          <w:sz w:val="24"/>
+          <w:szCs w:val="24"/>
+        </w:rPr>
+      </w:pPr>
+      <w:r>
+        <w:rPr>
+          <w:b/>
+          <w:bCs/>
+          <w:sz w:val="24"/>
+          <w:szCs w:val="24"/>
+        </w:rPr>
+        <w:t>Platforms</w:t>
+      </w:r>
+      <w:r>
+        <w:rPr>
+          <w:sz w:val="24"/>
+          <w:szCs w:val="24"/>
+        </w:rPr>
+        <w:t>: Android, iPhone</w:t>
+      </w:r>
+    </w:p>
+    <w:p>
+      <w:pPr>
+        <w:numPr>
+          <w:ilvl w:val="1"/>
+          <w:numId w:val="2"/>
+        </w:numPr>
+        <w:rPr>
+          <w:sz w:val="24"/>
+          <w:szCs w:val="24"/>
+        </w:rPr>
+      </w:pPr>
+      <w:r>
+        <w:rPr>
+          <w:b/>
+          <w:bCs/>
+          <w:sz w:val="24"/>
+          <w:szCs w:val="24"/>
+        </w:rPr>
+        <w:t>Website</w:t>
+      </w:r>
+      <w:r>
+        <w:rPr>
+          <w:sz w:val="24"/>
+          <w:szCs w:val="24"/>
+        </w:rPr>
+        <w:t>: </w:t>
+      </w:r>
+      <w:hyperlink r:id="rId8" w:tgtFrame="_blank" w:history="1">
+        <w:r>
+          <w:rPr>
+            <w:rStyle w:val="Hipervnculo"/>
+            <w:sz w:val="24"/>
+            <w:szCs w:val="24"/>
+          </w:rPr>
+          <w:t>edx.org</w:t>
+        </w:r>
+      </w:hyperlink>
+    </w:p>
+    <w:p>
+      <w:pPr>
+        <w:numPr>
+          <w:ilvl w:val="0"/>
+          <w:numId w:val="2"/>
+        </w:numPr>
+        <w:rPr>
+          <w:sz w:val="24"/>
+          <w:szCs w:val="24"/>
+        </w:rPr>
+      </w:pPr>
+      <w:r>
+        <w:rPr>
+          <w:b/>
+          <w:bCs/>
+          <w:sz w:val="24"/>
+          <w:szCs w:val="24"/>
+        </w:rPr>
+        <w:t>LinkedIn Learning</w:t>
+      </w:r>
+    </w:p>
+    <w:p>
+      <w:pPr>
+        <w:numPr>
+          <w:ilvl w:val="1"/>
+          <w:numId w:val="2"/>
+        </w:numPr>
+        <w:rPr>
+          <w:sz w:val="24"/>
+          <w:szCs w:val="24"/>
+          <w:lang w:val="en-US"/>
+        </w:rPr>
+      </w:pPr>
+      <w:r>
+        <w:rPr>
+          <w:b/>
+          <w:bCs/>
+          <w:sz w:val="24"/>
+          <w:szCs w:val="24"/>
+          <w:lang w:val="en-US"/>
+        </w:rPr>
+        <w:t>Description</w:t>
+      </w:r>
+      <w:r>
+        <w:rPr>
+          <w:sz w:val="24"/>
+          <w:szCs w:val="24"/>
+          <w:lang w:val="en-US"/>
+        </w:rPr>
+        <w:t>: Offers personalized courses on leadership and management skills.</w:t>
+      </w:r>
+    </w:p>
+    <w:p>
+      <w:pPr>
+        <w:numPr>
+          <w:ilvl w:val="1"/>
+          <w:numId w:val="2"/>
+        </w:numPr>
+        <w:rPr>
+          <w:sz w:val="24"/>
+          <w:szCs w:val="24"/>
+        </w:rPr>
+      </w:pPr>
+      <w:r>
+        <w:rPr>
+          <w:b/>
+          <w:bCs/>
+          <w:sz w:val="24"/>
+          <w:szCs w:val="24"/>
+        </w:rPr>
+        <w:lastRenderedPageBreak/>
+        <w:t>Platforms</w:t>
+      </w:r>
+      <w:r>
+        <w:rPr>
+          <w:sz w:val="24"/>
+          <w:szCs w:val="24"/>
+        </w:rPr>
+        <w:t>: Android, iPhone</w:t>
+      </w:r>
+    </w:p>
+    <w:p>
+      <w:pPr>
+        <w:numPr>
+          <w:ilvl w:val="1"/>
+          <w:numId w:val="2"/>
+        </w:numPr>
+        <w:rPr>
+          <w:sz w:val="24"/>
+          <w:szCs w:val="24"/>
+        </w:rPr>
+      </w:pPr>
+      <w:r>
+        <w:rPr>
+          <w:b/>
+          <w:bCs/>
+          <w:sz w:val="24"/>
+          <w:szCs w:val="24"/>
+        </w:rPr>
+        <w:t>Website</w:t>
+      </w:r>
+      <w:r>
+        <w:rPr>
+          <w:sz w:val="24"/>
+          <w:szCs w:val="24"/>
+        </w:rPr>
+        <w:t>: </w:t>
+      </w:r>
+      <w:hyperlink r:id="rId9" w:tgtFrame="_blank" w:history="1">
+        <w:r>
+          <w:rPr>
+            <w:rStyle w:val="Hipervnculo"/>
+            <w:sz w:val="24"/>
+            <w:szCs w:val="24"/>
+          </w:rPr>
+          <w:t>linkedin.com</w:t>
+        </w:r>
+      </w:hyperlink>
+    </w:p>
+    <w:p>
+      <w:pPr>
+        <w:numPr>
+          <w:ilvl w:val="0"/>
+          <w:numId w:val="2"/>
+        </w:numPr>
+        <w:rPr>
+          <w:sz w:val="24"/>
+          <w:szCs w:val="24"/>
+        </w:rPr>
+      </w:pPr>
+      <w:r>
+        <w:rPr>
+          <w:b/>
+          <w:bCs/>
+          <w:sz w:val="24"/>
+          <w:szCs w:val="24"/>
+        </w:rPr>
+        <w:t>Soft Skills Training App</w:t>
+      </w:r>
+    </w:p>
+    <w:p>
+      <w:pPr>
+        <w:numPr>
+          <w:ilvl w:val="1"/>
+          <w:numId w:val="2"/>
+        </w:numPr>
+        <w:rPr>
+          <w:sz w:val="24"/>
+          <w:szCs w:val="24"/>
+          <w:lang w:val="en-US"/>
+        </w:rPr>
+      </w:pPr>
+      <w:r>
+        <w:rPr>
+          <w:b/>
+          <w:bCs/>
+          <w:sz w:val="24"/>
+          <w:szCs w:val="24"/>
+          <w:lang w:val="en-US"/>
+        </w:rPr>
+        <w:t>Description</w:t>
+      </w:r>
+      <w:r>
+        <w:rPr>
+          <w:sz w:val="24"/>
+          <w:szCs w:val="24"/>
+          <w:lang w:val="en-US"/>
+        </w:rPr>
+        <w:t>: A gamified app that helps develop transversal skills like stress management and teamwork.</w:t>
+      </w:r>
+    </w:p>
+    <w:p>
+      <w:pPr>
+        <w:numPr>
+          <w:ilvl w:val="1"/>
+          <w:numId w:val="2"/>
+        </w:numPr>
+        <w:rPr>
+          <w:sz w:val="24"/>
+          <w:szCs w:val="24"/>
+        </w:rPr>
+      </w:pPr>
+      <w:r>
+        <w:rPr>
+          <w:b/>
+          <w:bCs/>
+          <w:sz w:val="24"/>
+          <w:szCs w:val="24"/>
+        </w:rPr>
+        <w:t>Platforms</w:t>
+      </w:r>
+      <w:r>
+        <w:rPr>
+          <w:sz w:val="24"/>
+          <w:szCs w:val="24"/>
+        </w:rPr>
+        <w:t>: Android, iPhone</w:t>
+      </w:r>
+    </w:p>
+    <w:p>
+      <w:pPr>
+        <w:numPr>
+          <w:ilvl w:val="1"/>
+          <w:numId w:val="2"/>
+        </w:numPr>
+        <w:rPr>
+          <w:sz w:val="24"/>
+          <w:szCs w:val="24"/>
+          <w:lang w:val="en-US"/>
+        </w:rPr>
+      </w:pPr>
+      <w:r>
+        <w:rPr>
+          <w:b/>
+          <w:bCs/>
+          <w:sz w:val="24"/>
+          <w:szCs w:val="24"/>
+          <w:lang w:val="en-US"/>
+        </w:rPr>
+        <w:t>Download</w:t>
+      </w:r>
+      <w:r>
+        <w:rPr>
+          <w:sz w:val="24"/>
+          <w:szCs w:val="24"/>
+          <w:lang w:val="en-US"/>
+        </w:rPr>
+        <w:t>: Apple Store and Google Play</w:t>
+      </w:r>
+    </w:p>
+    <w:p>
+      <w:pPr>
+        <w:rPr>
+          <w:sz w:val="24"/>
+          <w:szCs w:val="24"/>
+          <w:lang w:val="en-US"/>
+        </w:rPr>
+      </w:pPr>
+    </w:p>
+    <w:p>
+      <w:pPr>
+        <w:rPr>
+          <w:sz w:val="24"/>
+          <w:szCs w:val="24"/>
+          <w:lang w:val="en-US"/>
+        </w:rPr>
+      </w:pPr>
+      <w:r>
+        <w:rPr>
+          <w:sz w:val="24"/>
+          <w:szCs w:val="24"/>
+          <w:lang w:val="en-US"/>
+        </w:rPr>
+        <w:t xml:space="preserve">Source: </w:t>
+      </w:r>
+    </w:p>
+    <w:p>
+      <w:pPr>
+        <w:rPr>
+          <w:sz w:val="24"/>
+          <w:szCs w:val="24"/>
+          <w:lang w:val="en-US"/>
+        </w:rPr>
+      </w:pPr>
+      <w:hyperlink r:id="rId10" w:history="1">
+        <w:r>
+          <w:rPr>
+            <w:rStyle w:val="Hipervnculo"/>
+            <w:sz w:val="24"/>
+            <w:szCs w:val="24"/>
+            <w:lang w:val="en-US"/>
+          </w:rPr>
+          <w:t>https://virtualspeech.com/learn/soft-skills-apps</w:t>
+        </w:r>
+      </w:hyperlink>
+    </w:p>
+    <w:p>
+      <w:pPr>
+        <w:rPr>
+          <w:sz w:val="24"/>
+          <w:szCs w:val="24"/>
+          <w:lang w:val="en-US"/>
+        </w:rPr>
+      </w:pPr>
+      <w:hyperlink r:id="rId11" w:history="1">
+        <w:r>
+          <w:rPr>
+            <w:rStyle w:val="Hipervnculo"/>
+            <w:sz w:val="24"/>
+            <w:szCs w:val="24"/>
+            <w:lang w:val="en-US"/>
+          </w:rPr>
+          <w:t>https://magazine.playing4softskills.eu/project/soft-skills-training-app-an-interactive-platform-to-activate-and-develop-of-transversal-skills-on-an-individual-basis-and-in-a-playful-manner/</w:t>
+        </w:r>
+      </w:hyperlink>
+    </w:p>
+    <w:p>
+      <w:pPr>
+        <w:rPr>
+          <w:sz w:val="24"/>
+          <w:szCs w:val="24"/>
+          <w:lang w:val="en-US"/>
+        </w:rPr>
+      </w:pPr>
     </w:p>
     <w:sectPr>
       <w:pgSz w:w="12240" w:h="15840"/>
@@ -981,6 +1676,123 @@
 <file path=word/numbering.xml><?xml version="1.0" encoding="utf-8"?>
 <w:numbering xmlns:wpc="http://schemas.microsoft.com/office/word/2010/wordprocessingCanvas" xmlns:cx="http://schemas.microsoft.com/office/drawing/2014/chartex" xmlns:cx1="http://schemas.microsoft.com/office/drawing/2015/9/8/chartex" xmlns:cx2="http://schemas.microsoft.com/office/drawing/2015/10/21/chartex" xmlns:cx3="http://schemas.microsoft.com/office/drawing/2016/5/9/chartex" xmlns:cx4="http://schemas.microsoft.com/office/drawing/2016/5/10/chartex" xmlns:cx5="http://schemas.microsoft.com/office/drawing/2016/5/11/chartex" xmlns:cx6="http://schemas.microsoft.com/office/drawing/2016/5/12/chartex" xmlns:cx7="http://schemas.microsoft.com/office/drawing/2016/5/13/chartex" xmlns:cx8="http://schemas.microsoft.com/office/drawing/2016/5/14/chartex" xmlns:mc="http://schemas.openxmlformats.org/markup-compatibility/2006" xmlns:aink="http://schemas.microsoft.com/office/drawing/2016/ink" xmlns:am3d="http://schemas.microsoft.com/office/drawing/2017/model3d" xmlns:o="urn:schemas-microsoft-com:office:office" xmlns:oel="http://schemas.microsoft.com/office/2019/extlst" xmlns:r="http://schemas.openxmlformats.org/officeDocument/2006/relationships" xmlns:m="http://schemas.openxmlformats.org/officeDocument/2006/math" xmlns:v="urn:schemas-microsoft-com:vml" xmlns:wp14="http://schemas.microsoft.com/office/word/2010/wordprocessingDrawing" xmlns:wp="http://schemas.openxmlformats.org/drawingml/2006/wordprocessingDrawing" xmlns:w10="urn:schemas-microsoft-com:office:word" xmlns:w="http://schemas.openxmlformats.org/wordprocessingml/2006/main" xmlns:w14="http://schemas.microsoft.com/office/word/2010/wordml" xmlns:w15="http://schemas.microsoft.com/office/word/2012/wordml" xmlns:w16cex="http://schemas.microsoft.com/office/word/2018/wordml/cex" xmlns:w16cid="http://schemas.microsoft.com/office/word/2016/wordml/cid" xmlns:w16="http://schemas.microsoft.com/office/word/2018/wordml" xmlns:w16du="http://schemas.microsoft.com/office/word/2023/wordml/word16du" xmlns:w16sdtdh="http://schemas.microsoft.com/office/word/2020/wordml/sdtdatahash" xmlns:w16sdtfl="http://schemas.microsoft.com/office/word/2024/wordml/sdtformatlock" xmlns:w16se="http://schemas.microsoft.com/office/word/2015/wordml/symex" xmlns:wpg="http://schemas.microsoft.com/office/word/2010/wordprocessingGroup" xmlns:wpi="http://schemas.microsoft.com/office/word/2010/wordprocessingInk" xmlns:wne="http://schemas.microsoft.com/office/word/2006/wordml" xmlns:wps="http://schemas.microsoft.com/office/word/2010/wordprocessingShape" mc:Ignorable="w14 w15 w16se w16cid w16 w16cex w16sdtdh w16sdtfl w16du wp14">
   <w:abstractNum w:abstractNumId="0" w15:restartNumberingAfterBreak="0">
+    <w:nsid w:val="49311A1F"/>
+    <w:multiLevelType w:val="multilevel"/>
+    <w:tmpl w:val="790C5716"/>
+    <w:lvl w:ilvl="0">
+      <w:start w:val="1"/>
+      <w:numFmt w:val="decimal"/>
+      <w:lvlText w:val="%1."/>
+      <w:lvlJc w:val="left"/>
+      <w:pPr>
+        <w:tabs>
+          <w:tab w:val="num" w:pos="720"/>
+        </w:tabs>
+        <w:ind w:left="720" w:hanging="360"/>
+      </w:pPr>
+    </w:lvl>
+    <w:lvl w:ilvl="1">
+      <w:start w:val="1"/>
+      <w:numFmt w:val="bullet"/>
+      <w:lvlText w:val=""/>
+      <w:lvlJc w:val="left"/>
+      <w:pPr>
+        <w:tabs>
+          <w:tab w:val="num" w:pos="1440"/>
+        </w:tabs>
+        <w:ind w:left="1440" w:hanging="360"/>
+      </w:pPr>
+      <w:rPr>
+        <w:rFonts w:ascii="Symbol" w:hAnsi="Symbol" w:hint="default"/>
+        <w:sz w:val="20"/>
+      </w:rPr>
+    </w:lvl>
+    <w:lvl w:ilvl="2" w:tentative="1">
+      <w:start w:val="1"/>
+      <w:numFmt w:val="decimal"/>
+      <w:lvlText w:val="%3."/>
+      <w:lvlJc w:val="left"/>
+      <w:pPr>
+        <w:tabs>
+          <w:tab w:val="num" w:pos="2160"/>
+        </w:tabs>
+        <w:ind w:left="2160" w:hanging="360"/>
+      </w:pPr>
+    </w:lvl>
+    <w:lvl w:ilvl="3" w:tentative="1">
+      <w:start w:val="1"/>
+      <w:numFmt w:val="decimal"/>
+      <w:lvlText w:val="%4."/>
+      <w:lvlJc w:val="left"/>
+      <w:pPr>
+        <w:tabs>
+          <w:tab w:val="num" w:pos="2880"/>
+        </w:tabs>
+        <w:ind w:left="2880" w:hanging="360"/>
+      </w:pPr>
+    </w:lvl>
+    <w:lvl w:ilvl="4" w:tentative="1">
+      <w:start w:val="1"/>
+      <w:numFmt w:val="decimal"/>
+      <w:lvlText w:val="%5."/>
+      <w:lvlJc w:val="left"/>
+      <w:pPr>
+        <w:tabs>
+          <w:tab w:val="num" w:pos="3600"/>
+        </w:tabs>
+        <w:ind w:left="3600" w:hanging="360"/>
+      </w:pPr>
+    </w:lvl>
+    <w:lvl w:ilvl="5" w:tentative="1">
+      <w:start w:val="1"/>
+      <w:numFmt w:val="decimal"/>
+      <w:lvlText w:val="%6."/>
+      <w:lvlJc w:val="left"/>
+      <w:pPr>
+        <w:tabs>
+          <w:tab w:val="num" w:pos="4320"/>
+        </w:tabs>
+        <w:ind w:left="4320" w:hanging="360"/>
+      </w:pPr>
+    </w:lvl>
+    <w:lvl w:ilvl="6" w:tentative="1">
+      <w:start w:val="1"/>
+      <w:numFmt w:val="decimal"/>
+      <w:lvlText w:val="%7."/>
+      <w:lvlJc w:val="left"/>
+      <w:pPr>
+        <w:tabs>
+          <w:tab w:val="num" w:pos="5040"/>
+        </w:tabs>
+        <w:ind w:left="5040" w:hanging="360"/>
+      </w:pPr>
+    </w:lvl>
+    <w:lvl w:ilvl="7" w:tentative="1">
+      <w:start w:val="1"/>
+      <w:numFmt w:val="decimal"/>
+      <w:lvlText w:val="%8."/>
+      <w:lvlJc w:val="left"/>
+      <w:pPr>
+        <w:tabs>
+          <w:tab w:val="num" w:pos="5760"/>
+        </w:tabs>
+        <w:ind w:left="5760" w:hanging="360"/>
+      </w:pPr>
+    </w:lvl>
+    <w:lvl w:ilvl="8" w:tentative="1">
+      <w:start w:val="1"/>
+      <w:numFmt w:val="decimal"/>
+      <w:lvlText w:val="%9."/>
+      <w:lvlJc w:val="left"/>
+      <w:pPr>
+        <w:tabs>
+          <w:tab w:val="num" w:pos="6480"/>
+        </w:tabs>
+        <w:ind w:left="6480" w:hanging="360"/>
+      </w:pPr>
+    </w:lvl>
+  </w:abstractNum>
+  <w:abstractNum w:abstractNumId="1" w15:restartNumberingAfterBreak="0">
     <w:nsid w:val="5178271A"/>
     <w:multiLevelType w:val="hybridMultilevel"/>
     <w:tmpl w:val="A9B867F4"/>
@@ -1072,6 +1884,9 @@
     </w:lvl>
   </w:abstractNum>
   <w:num w:numId="1" w16cid:durableId="29843648">
+    <w:abstractNumId w:val="1"/>
+  </w:num>
+  <w:num w:numId="2" w16cid:durableId="620495548">
     <w:abstractNumId w:val="0"/>
   </w:num>
 </w:numbering>
@@ -1680,7 +2495,6 @@
   <w:style w:type="character" w:default="1" w:styleId="Fuentedeprrafopredeter">
     <w:name w:val="Default Paragraph Font"/>
     <w:uiPriority w:val="1"/>
-    <w:semiHidden/>
     <w:unhideWhenUsed/>
   </w:style>
   <w:style w:type="table" w:default="1" w:styleId="Tablanormal">

</xml_diff>